<commit_message>
Report: readability edit pass and sync numbers with code
Plainer wording in abstract, objectives, introduction, literature review,
research gap, problem statement and methodology. Fix stale values so text,
slides and diagrams match the implementation: repair hold-off 6 ms and
adaptive window W = clamp(10 + 3(owd + 4*jitter), 10, 100) ms; describe
batched NACK request rounds.

Co-Authored-By: Claude Sonnet 5.5 <noreply@anthropic.com>
</commit_message>
<xml_diff>
--- a/ReliCast_Report.docx
+++ b/ReliCast_Report.docx
@@ -1514,7 +1514,7 @@
           <w:b w:val="0"/>
           <w:i w:val="0"/>
         </w:rPr>
-        <w:t>Distributing one file to many hosts on a local network is usually done with N separate TCP transfers, which makes the sender transmit N copies, or with raw UDP multicast, which is cheap but silently loses data. This work presents ReliCast, a Python socket-level tool that sends one multicast copy and recovers losses with receiver-driven negative acknowledgements. As in SRM and NORM, receivers delay NACKs by a random timer in [0, W) and cancel them when another receiver asks for the same data, and the sender aggregates repairs. A TCP channel carries control data, and an SNTP client and server (RFC 4330) synchronise clocks so one-way delay and jitter are measurable. A real-file mode adds broadcast discovery and a TCP fallback for receivers that cannot hear multicast. Four modes were compared for up to 16 receivers and up to 20% loss. With 16 receivers ReliCast needed 0.39 s against 2.28 s for TCP, with an overhead ratio of 1.72x against 18.30x, and every ReliCast transfer was verified with SHA-256. At the demonstration point it sent 130 NACKs where the naive scheme sent 322, and SNTP recovered injected clock skews of up to 360 ms to within 0.42 ms.</w:t>
+        <w:t>Sending one file to many machines on a LAN usually means either N separate TCP transfers, so the sender transmits N copies, or raw UDP multicast, which is cheap but silently loses data. We built ReliCast, a Python socket-level tool that sends one multicast copy and recovers losses through receiver-driven negative acknowledgements (NACKs). Following SRM and NORM, receivers wait a random time in [0, W) before sending a NACK and drop it if another receiver has already asked for the same data, while the sender merges repair requests. A TCP channel carries control messages, and our SNTP client and server (RFC 4330) synchronise clocks so that one-way delay and jitter can be measured. A real-file mode adds broadcast discovery and a TCP fallback for receivers that cannot hear multicast. Four modes were compared for up to 16 receivers and up to 20% loss. With 16 receivers ReliCast needed 0.39 s against 2.28 s for TCP, with an overhead ratio of 1.72x against 18.30x, and every ReliCast transfer was verified with SHA-256. At the demonstration point it sent 130 NACKs where the naive scheme sent 322, and SNTP recovered injected clock skews of up to 360 ms to within 0.42 ms.</w:t>
       </w:r>
     </w:p>
     <w:p>
@@ -1559,7 +1559,7 @@
           <w:b w:val="0"/>
           <w:i w:val="0"/>
         </w:rPr>
-        <w:t>The assessment aimed to apply the Network Programming syllabus to one realistic problem, delivering a file to many receivers on a LAN, and to evaluate the result quantitatively. The specific objectives were:</w:t>
+        <w:t>This assessment applies the Network Programming syllabus to one practical problem: delivering a file to many receivers on a LAN, and measuring how well the solution works. Our specific objectives were:</w:t>
       </w:r>
     </w:p>
     <w:p>
@@ -1604,7 +1604,7 @@
           <w:b w:val="0"/>
           <w:i w:val="0"/>
         </w:rPr>
-        <w:t>3.  To study the two reference designs for scalable reliable multicast, SRM and NORM, and extract the mechanisms (randomised NACK timers, suppression, repair aggregation) that avoid ACK/NACK implosion.</w:t>
+        <w:t>3.  To study the two reference designs for scalable reliable multicast, SRM and NORM, and pick out the mechanisms that avoid ACK/NACK implosion: randomised NACK timers, suppression and repair aggregation.</w:t>
       </w:r>
     </w:p>
     <w:p>
@@ -1664,7 +1664,7 @@
           <w:b w:val="0"/>
           <w:i w:val="0"/>
         </w:rPr>
-        <w:t>7.  To extend the system into a usable file-transfer tool for real devices (broadcast discovery, multicast reachability probe with automatic TCP fallback, SHA-256 verified saving), with a live web dashboard and a reproducible experiment harness.</w:t>
+        <w:t>7.  To turn the system into a usable file-transfer tool for real devices, with broadcast discovery, a multicast reachability probe that falls back to TCP automatically, SHA-256 verified saving, a live web dashboard and a reproducible experiment harness.</w:t>
       </w:r>
     </w:p>
     <w:p>
@@ -1694,7 +1694,7 @@
           <w:b w:val="0"/>
           <w:i w:val="0"/>
         </w:rPr>
-        <w:t xml:space="preserve">Network programming is the discipline of writing programs that communicate across a network through the operating system’s transport services. The application studied here is </w:t>
+        <w:t xml:space="preserve">Network programming is about writing programs that talk to each other across a network using the services the operating system provides. The application we picked is </w:t>
       </w:r>
       <w:r>
         <w:rPr>
@@ -1702,7 +1702,7 @@
           <w:b w:val="0"/>
           <w:i/>
         </w:rPr>
-        <w:t>one-to-many content distribution on a local area network</w:t>
+        <w:t>one-to-many content distribution on a local network</w:t>
       </w:r>
       <w:r>
         <w:rPr>
@@ -1710,7 +1710,7 @@
           <w:b w:val="0"/>
           <w:i w:val="0"/>
         </w:rPr>
-        <w:t>: a teacher pushes lecture slides, or an administrator pushes an update package, to every laptop in a laboratory. When the sender opens a separate TCP connection to each of N machines it must put N copies of the file on its uplink, so the transfer time grows linearly with N. IP multicast removes this cost by sending one copy that the network replicates to every member of a group address, but multicast uses UDP, which offers no retransmission, ordering or flow control. A practical tool therefore has to add reliability on top of multicast without recreating the scalability problem, which is exactly the design space of the two papers reviewed in Chapter 4.</w:t>
+        <w:t>: a teacher pushes lecture slides, or an administrator pushes an update package, to every laptop in a lab. If the sender opens a separate TCP connection to each of N machines, it has to put N copies of the file on its uplink, so the transfer time grows linearly with N. IP multicast avoids this by sending one copy that the network delivers to every member of a group address. The catch is that multicast runs over UDP, which gives no retransmission, ordering or flow control. A practical tool therefore has to add reliability on top of multicast without bringing the scalability problem back, and that is exactly the design space of the two papers reviewed in Chapter 4.</w:t>
       </w:r>
     </w:p>
     <w:p>
@@ -1732,7 +1732,7 @@
           <w:b w:val="0"/>
           <w:i w:val="0"/>
         </w:rPr>
-        <w:t>TCP provides a reliable, ordered byte stream with connection set-up, acknowledgements, retransmission and congestion control. It is the right choice for small, important messages, and ReliCast uses it for the session metadata and the final per-receiver statistics. UDP is connectionless and preserves datagram boundaries; it adds only ports and a checksum to IP, so the application owns reliability, ordering and pacing. Unicast addresses one host, broadcast addresses everybody on a subnet whether interested or not, and multicast (RFC 1112) addresses a group of interested hosts that join through IGMP. A sender transmits a single datagram to a class D address, here the administratively scoped range 239.0.0.0/8 (RFC 2365), and its TTL limits how far the datagram travels. The price of multicast is that the sender no longer has a per-receiver connection on which to learn about loss.</w:t>
+        <w:t>TCP gives a reliable, ordered byte stream with connection set-up, acknowledgements, retransmission and congestion control. It suits small but important messages, so ReliCast uses it for session metadata and the final per-receiver statistics. UDP is connectionless and keeps datagram boundaries; it adds only port numbers and a checksum on top of IP, which leaves reliability, ordering and pacing to the application. Unicast addresses one host, broadcast addresses every host on the subnet whether it cares or not, and multicast (RFC 1112) addresses a group of hosts that have asked to join, using IGMP. A sender transmits one datagram to a class D address, here in the administratively scoped range 239.0.0.0/8 (RFC 2365), and the TTL limits how far it travels. What multicast takes away is the per-receiver connection through which the sender would normally learn about loss.</w:t>
       </w:r>
     </w:p>
     <w:p>
@@ -1754,7 +1754,7 @@
           <w:b w:val="0"/>
           <w:i w:val="0"/>
         </w:rPr>
-        <w:t>Every capability above is reached through system calls exposed by Python’s socket module. socket() creates an endpoint, bind() attaches it to an address and port, listen() and accept() implement the server side of TCP, and connect() the client side. For UDP, sendto() and recvfrom() carry individual datagrams. setsockopt() configures behaviour: SO_REUSEADDR and SO_REUSEPORT let several receiver processes share one multicast port on a host, SO_RCVBUF enlarges the kernel receive queue so bursts are not dropped, IP_MULTICAST_TTL, IP_MULTICAST_IF and IP_MULTICAST_LOOP control scope, interface and loopback delivery, IP_ADD_MEMBERSHIP joins a group, and SO_BROADCAST permits sending to the broadcast address. select() multiplexes several sockets and a timer in one thread, and struct.pack with the ‘!’ prefix produces network byte order headers. Section 7.5 maps each call to its use in ReliCast.</w:t>
+        <w:t>All of this is reached through system calls exposed by Python’s socket module. socket() creates an endpoint, bind() attaches it to an address and port, listen() and accept() make up the server side of TCP and connect() the client side. For UDP, sendto() and recvfrom() move individual datagrams. setsockopt() changes behaviour: SO_REUSEADDR and SO_REUSEPORT let several receiver processes share one multicast port on a host, SO_RCVBUF enlarges the kernel receive queue so bursts are not dropped, IP_MULTICAST_TTL, IP_MULTICAST_IF and IP_MULTICAST_LOOP control scope, interface and loopback delivery, IP_ADD_MEMBERSHIP joins a group, and SO_BROADCAST allows sending to the broadcast address. select() waits on several sockets and a timer in a single thread, and struct.pack with the ‘!’ prefix builds headers in network byte order. Section 7.5 shows where each call is used in ReliCast.</w:t>
       </w:r>
     </w:p>
     <w:p>
@@ -1776,7 +1776,7 @@
           <w:b w:val="0"/>
           <w:i w:val="0"/>
         </w:rPr>
-        <w:t>One-way delay cannot be measured between two machines whose clocks disagree, which is why most reliable-multicast evaluations report round-trip time or simulated time. The Simple Network Time Protocol (RFC 4330) estimates the offset between a client and a server clock from four timestamps carried in a 48-byte UDP packet. ReliCast embeds an SNTP server in the sender and an SNTP client in every receiver, so that data packets can carry sender timestamps in a common time base.</w:t>
+        <w:t>You cannot measure one-way delay between two machines whose clocks disagree, which is why many reliable-multicast evaluations report round-trip time or simulated time instead. The Simple Network Time Protocol (RFC 4330) estimates the offset between a client clock and a server clock from four timestamps carried in a 48-byte UDP packet. ReliCast runs an SNTP server inside the sender and an SNTP client in every receiver, so data packets can carry sender timestamps that mean the same thing at both ends.</w:t>
       </w:r>
     </w:p>
     <w:p>
@@ -1798,7 +1798,7 @@
           <w:b w:val="0"/>
           <w:i w:val="0"/>
         </w:rPr>
-        <w:t>The system is written in Python 3 using only the standard library (socket, select, struct, threading, hashlib, json, http.server), so it runs unchanged on Windows, macOS and Linux. Receivers are real operating-system processes. A single-file dashboard served by http.server visualises transfers live. Packet formats and counters were inspected in the manner of a Wireshark session, by decoding the 24-byte header, and the analysis scripts use matplotlib, python-docx and python-pptx to turn the experiment output into the figures and this report.</w:t>
+        <w:t>The system is written in Python 3 and uses only the standard library (socket, select, struct, threading, hashlib, json, http.server), so it runs unchanged on Windows, macOS and Linux. Each receiver is a separate operating-system process. A single-file web dashboard served by http.server shows transfers live. We inspected packets the way one would in Wireshark, by decoding the 24-byte header, and used matplotlib, python-docx and python-pptx to turn the experiment output into figures and this report.</w:t>
       </w:r>
     </w:p>
     <w:p>
@@ -1820,7 +1820,7 @@
           <w:b w:val="0"/>
           <w:i w:val="0"/>
         </w:rPr>
-        <w:t>This project is anchored on two foundational works on scalable reliable multicast: the SRM framework of Floyd et al. [1] and the NORM transport protocol of Adamson et al. [2]. Together they define the two classic ways, receiver-side and sender-side, of keeping negative acknowledgements from overwhelming a multicast session. RFC 4330 [3] and RFC 1112 [4] serve only as supporting specifications.</w:t>
+        <w:t>This project builds on two foundational works on scalable reliable multicast: the SRM framework of Floyd et al. [1] and the NORM protocol of Adamson et al. [2]. Between them they show the two classic ways, receiver-side and sender-side, of stopping negative acknowledgements from overwhelming a multicast session. RFC 4330 [3] and RFC 1112 [4] are used only as supporting specifications.</w:t>
       </w:r>
     </w:p>
     <w:p>
@@ -1850,7 +1850,7 @@
           <w:b w:val="0"/>
           <w:i w:val="0"/>
         </w:rPr>
-        <w:t xml:space="preserve"> Sender-driven reliability does not scale to large multicast groups because every receiver’s acknowledgement lands on the sender (ACK implosion), and the sender must track the state of every receiver. The authors argue for recovery in the application, following </w:t>
+        <w:t xml:space="preserve"> Sender-driven reliability does not scale to large multicast groups: every receiver’s acknowledgement lands on the sender (ACK implosion), and the sender has to track the state of each receiver. The authors argue for recovery in the application itself, following </w:t>
       </w:r>
       <w:r>
         <w:rPr>
@@ -1882,7 +1882,7 @@
           <w:b w:val="0"/>
           <w:i w:val="0"/>
         </w:rPr>
-        <w:t xml:space="preserve"> In SRM each data unit has a persistent name, and receivers detect loss from gaps in sequence numbers or from periodic </w:t>
+        <w:t xml:space="preserve"> Each data unit in SRM has a persistent name, and receivers notice loss from gaps in sequence numbers or from periodic </w:t>
       </w:r>
       <w:r>
         <w:rPr>
@@ -1898,7 +1898,7 @@
           <w:b w:val="0"/>
           <w:i w:val="0"/>
         </w:rPr>
-        <w:t xml:space="preserve">. A receiver that detects a loss schedules a repair request at a random time drawn uniformly from [C1·d, (C1+C2)·d], where d is its estimated distance to the source. If it hears a request for the same data before the timer fires, it suppresses its own and backs off exponentially. Any member holding the data may answer after a random timer proportional to its distance from the requester, and a heard repair cancels the other pending repairs. Timer parameters adapt to observed duplicates and delay, and TTL-scoped local recovery limits the reach of repairs. </w:t>
+        <w:t xml:space="preserve">. A receiver that detects a loss schedules a repair request at a random time drawn uniformly from [C1·d, (C1+C2)·d], where d is its estimated distance to the source. If it hears a request for the same data before its timer fires, it suppresses its own request and backs off exponentially. Any member that holds the data can answer after a random timer proportional to its distance from the requester, and hearing a repair cancels the other pending repairs. The timer parameters adapt to observed duplicates and delay, and TTL-scoped local recovery limits how far repairs travel. </w:t>
       </w:r>
       <w:r>
         <w:rPr>
@@ -1914,7 +1914,7 @@
           <w:b w:val="0"/>
           <w:i w:val="0"/>
         </w:rPr>
-        <w:t xml:space="preserve"> Using ns-2 simulations on chain, star and bounded-degree tree topologies, and the </w:t>
+        <w:t xml:space="preserve"> The paper uses ns-2 simulations on chain, star and bounded-degree tree topologies, with the </w:t>
       </w:r>
       <w:r>
         <w:rPr>
@@ -1930,7 +1930,7 @@
           <w:b w:val="0"/>
           <w:i w:val="0"/>
         </w:rPr>
-        <w:t xml:space="preserve"> shared whiteboard as a driving application, the paper shows that deterministic suppression works in chains, probabilistic suppression in stars, and that the adaptive timers keep both duplicates and delay low as session size grows. </w:t>
+        <w:t xml:space="preserve"> shared whiteboard as the driving application. It shows that deterministic suppression works in chains, probabilistic suppression works in stars, and that the adaptive timers keep both duplicates and delay low as the session grows. </w:t>
       </w:r>
       <w:r>
         <w:rPr>
@@ -1946,7 +1946,7 @@
           <w:b w:val="0"/>
           <w:i w:val="0"/>
         </w:rPr>
-        <w:t xml:space="preserve"> Every request and repair is multicast to the whole group; the distance estimates require session-message exchange that itself grows with group size; the study is simulation based and gives no measured one-way delay on real hosts; and the timer constants must be tuned or adapted per topology. </w:t>
+        <w:t xml:space="preserve"> Every request and repair is multicast to the whole group. The distance estimates need session-message exchange, which itself grows with group size. The study is simulation based and reports no measured one-way delay on real hosts, and the timer constants have to be tuned or adapted for each topology. </w:t>
       </w:r>
       <w:r>
         <w:rPr>
@@ -1962,7 +1962,7 @@
           <w:b w:val="0"/>
           <w:i w:val="0"/>
         </w:rPr>
-        <w:t xml:space="preserve"> ReliCast adopts SRM’s randomised request timers, suppression on overheard requests and exponential back-off, and replaces the distance term with an adaptive window computed from SNTP-synchronised delay and jitter.</w:t>
+        <w:t xml:space="preserve"> ReliCast takes SRM’s randomised request timers, suppression on overheard requests and exponential back-off. In place of the distance term it uses an adaptive window computed from SNTP-synchronised delay and jitter.</w:t>
       </w:r>
     </w:p>
     <w:p>
@@ -2008,7 +2008,7 @@
           <w:b w:val="0"/>
           <w:i w:val="0"/>
         </w:rPr>
-        <w:t xml:space="preserve"> NORM is a NACK-oriented protocol with a single logical sender per session. The sender transmits objects as numbered coding blocks and symbols, advertises its state with heartbeat-style flush commands, and keeps a running estimate of the group round-trip time (GRTT) from receiver responses. A receiver that finds missing data waits for a random back-off whose range is scaled by the advertised GRTT before sending its NACK, and cancels the NACK if it overhears an equivalent or larger one. The sender does not answer each NACK immediately: it </w:t>
+        <w:t xml:space="preserve"> NORM is NACK-oriented, with one logical sender per session. The sender transmits objects as numbered coding blocks and symbols, advertises its state with heartbeat-style flush commands, and keeps a running estimate of the group round-trip time (GRTT) from receiver responses. A receiver that finds missing data waits for a random back-off, scaled by the advertised GRTT, before sending its NACK, and cancels it if it overhears an equivalent or larger one. The sender does not answer each NACK immediately: it </w:t>
       </w:r>
       <w:r>
         <w:rPr>
@@ -2024,7 +2024,7 @@
           <w:b w:val="0"/>
           <w:i w:val="0"/>
         </w:rPr>
-        <w:t xml:space="preserve"> the requests arriving within a repair cycle and transmits the union once, optionally using forward-error-correction parity. Congestion control and positive acknowledgement are optional. </w:t>
+        <w:t xml:space="preserve"> the requests that arrive within a repair cycle and transmits the union once, optionally using forward-error-correction parity. Congestion control and positive acknowledgement are optional. </w:t>
       </w:r>
       <w:r>
         <w:rPr>
@@ -2040,7 +2040,7 @@
           <w:b w:val="0"/>
           <w:i w:val="0"/>
         </w:rPr>
-        <w:t xml:space="preserve"> RFC 5740 is a standards-track specification, so it reports design rationale and protocol analysis rather than a measurement campaign. </w:t>
+        <w:t xml:space="preserve"> RFC 5740 is a standards-track specification, so it gives design rationale and protocol analysis rather than a measurement campaign. </w:t>
       </w:r>
       <w:r>
         <w:rPr>
@@ -2056,7 +2056,7 @@
           <w:b w:val="0"/>
           <w:i w:val="0"/>
         </w:rPr>
-        <w:t xml:space="preserve"> Suppression timing depends on the GRTT estimate that the sender must maintain from feedback; the specification does not provide a method to measure one-way delay across unsynchronised hosts; and the full protocol with FEC and congestion control is considerably more complex than a LAN file-push tool needs. </w:t>
+        <w:t xml:space="preserve"> Suppression timing depends on a GRTT estimate that the sender must maintain from feedback. The specification offers no way to measure one-way delay between unsynchronised hosts, and the full protocol with FEC and congestion control is far more complex than a LAN file-push tool needs. </w:t>
       </w:r>
       <w:r>
         <w:rPr>
@@ -2072,7 +2072,7 @@
           <w:b w:val="0"/>
           <w:i w:val="0"/>
         </w:rPr>
-        <w:t xml:space="preserve"> ReliCast takes from NORM the sender-side repair aggregation (a 10 ms hold-off that merges ranges into a union), a repair guard against re-sending data that was just repaired, and the heartbeat that lets receivers find tail losses.</w:t>
+        <w:t xml:space="preserve"> From NORM, ReliCast takes sender-side repair aggregation (a 6 ms hold-off that merges requested ranges into a union), a repair guard that stops a chunk from being re-sent right after it was repaired, and the heartbeat that lets receivers find losses at the tail of a transfer.</w:t>
       </w:r>
     </w:p>
     <w:p>
@@ -2670,7 +2670,7 @@
           <w:b w:val="0"/>
           <w:i w:val="0"/>
         </w:rPr>
-        <w:t>Reading SRM and NORM together exposes several open points. First, both rely on timers whose range comes from a distance or round-trip estimate, and neither tunes the suppression window from measured one-way delay and delay variation. Second, SRM’s evidence comes from ns-2 simulations, and RFC 5740 contains no measurement section, so there are few published numbers for how many NACKs are really suppressed, or how much repair traffic the sender saves, on live operating-system sockets. Third, one-way delay and jitter, the quantities that actually determine how long a randomised timer can safely wait, are never reported because sender and receiver clocks are not synchronised, and round-trip time hides the direction in which a path is slow. Fourth, comparisons with the obvious baselines, one TCP connection per receiver and raw UDP, are usually only qualitative, which makes it hard for a practitioner to decide when reliable multicast is worth its complexity. Finally, both designs assume the full protocol machinery and say little about a small, portable, dependency-free implementation suitable for a campus laboratory.</w:t>
+        <w:t>Reading SRM and NORM side by side leaves several points open. First, both rely on timers whose range comes from a distance or round-trip estimate, and neither tunes the suppression window from measured one-way delay and delay variation. Second, SRM’s evidence comes from ns-2 simulations and RFC 5740 has no measurement section, so there are few published numbers on how many NACKs are really suppressed, or how much repair traffic the sender saves, on live operating-system sockets. Third, one-way delay and jitter, which decide how long a randomised timer can safely wait, are never reported because sender and receiver clocks are not synchronised, and round-trip time hides which direction of a path is slow. Fourth, comparisons with the obvious baselines, one TCP connection per receiver and raw UDP, are usually only qualitative, so it is hard for a practitioner to judge when reliable multicast is worth the extra complexity. Finally, both designs assume the full protocol machinery and say little about a small, portable, dependency-free implementation for a campus lab.</w:t>
       </w:r>
     </w:p>
     <w:p>
@@ -2684,7 +2684,7 @@
           <w:b w:val="0"/>
           <w:i w:val="0"/>
         </w:rPr>
-        <w:t xml:space="preserve">Among these we narrow the work to a single gap: </w:t>
+        <w:t xml:space="preserve">Of these, we focus on one gap: </w:t>
       </w:r>
       <w:r>
         <w:rPr>
@@ -2692,7 +2692,7 @@
           <w:b/>
           <w:i w:val="0"/>
         </w:rPr>
-        <w:t>there is no real-socket study of NACK-suppressed reliable multicast that (a) adapts the suppression window from SNTP-synchronised one-way delay and jitter and (b) quantifies its benefit against TCP-unicast, raw-UDP and un-suppressed multicast baselines in the same experimental harness.</w:t>
+        <w:t>there is no real-socket study of NACK-suppressed reliable multicast that (a) adapts the suppression window from SNTP-synchronised one-way delay and jitter and (b) measures its benefit against TCP-unicast, raw-UDP and un-suppressed multicast baselines in the same experimental harness.</w:t>
       </w:r>
       <w:r>
         <w:rPr>
@@ -2700,7 +2700,7 @@
           <w:b w:val="0"/>
           <w:i w:val="0"/>
         </w:rPr>
-        <w:t xml:space="preserve"> The remaining points are noted as future work. This gap is well suited to a network programming assessment because closing it requires exactly the skills in the syllabus: TCP and UDP sockets, multicast group management, socket options, I/O multiplexing and an implementation of an Internet time protocol.</w:t>
+        <w:t xml:space="preserve"> The other points are left as future work. The gap suits a network programming assessment because closing it needs exactly the skills in the syllabus: TCP and UDP sockets, multicast group management, socket options, I/O multiplexing and an implementation of an Internet time protocol.</w:t>
       </w:r>
     </w:p>
     <w:p>
@@ -2820,7 +2820,7 @@
           <w:b w:val="0"/>
           <w:i w:val="0"/>
         </w:rPr>
-        <w:t>The measurable outcome is the set of metrics of Chapter 8: transfer duration, overhead ratio (total bytes on the wire divided by the file size), delivery ratio, NACK, suppressed-NACK and repair packet counts, SNTP-corrected one-way delay and jitter, and the accuracy of the SNTP offset estimate. The approach is considered successful if ReliCast delivers 100% of the data to every receiver while its overhead ratio grows much more slowly with N than that of the unicast baselines and its NACK and repair traffic is clearly below that of the naive multicast scheme.</w:t>
+        <w:t>The measurable outcome is the set of metrics in Chapter 8: transfer duration, overhead ratio (total bytes on the wire divided by the file size), delivery ratio, NACK, suppressed-NACK and repair packet counts, SNTP-corrected one-way delay and jitter, and the accuracy of the SNTP offset estimate. The approach counts as successful if ReliCast delivers 100% of the data to every receiver while its overhead ratio grows much more slowly with N than that of the unicast baselines, and its NACK and repair traffic stays clearly below that of the naive multicast scheme.</w:t>
       </w:r>
     </w:p>
     <w:p>
@@ -2850,7 +2850,7 @@
           <w:b w:val="0"/>
           <w:i w:val="0"/>
         </w:rPr>
-        <w:t>ReliCast has one sender process and N receiver processes (Figure 7.1). The sender chunks the file into 1 KB pieces, computes its SHA-256 digest, listens for TCP control connections, runs a tiny SNTP server, and finally paces the multicast transmission at a fixed packet rate. This rate models a shared uplink and also provides the flow control that UDP lacks. Every receiver is a separate operating-system process that talks to the sender over TCP, SNTP and the multicast group. The datagram format (Figure 7.2) follows Application Level Framing: each packet carries a 24-byte header with magic, type, flags, session id, sequence number, total chunk count and a sender timestamp in SNTP-corrected microseconds, so any packet can be interpreted without context. The packet types are DATA, REPAIR, HEARTBEAT (carries the highest sequence sent), NACK (receiver id and inclusive sequence ranges), FIN and PROBE.</w:t>
+        <w:t>ReliCast has one sender process and N receiver processes (Figure 7.1). The sender cuts the file into 1 KB chunks, computes its SHA-256 digest, listens for TCP control connections, runs a small SNTP server and then sends the multicast stream at a fixed packet rate. That rate stands in for a shared uplink and also supplies the flow control that UDP lacks. Every receiver is a separate operating-system process that talks to the sender over TCP, SNTP and the multicast group. The datagram format (Figure 7.2) follows Application Level Framing: each packet carries a 24-byte header with a magic value, type, flags, session id, sequence number, total chunk count and a sender timestamp in SNTP-corrected microseconds, so it can be understood without any other context. The packet types are DATA, REPAIR, HEARTBEAT (carries the highest sequence sent), NACK (receiver id and inclusive sequence ranges), FIN and PROBE.</w:t>
       </w:r>
     </w:p>
     <w:p>
@@ -2996,7 +2996,7 @@
           <w:b w:val="0"/>
           <w:i w:val="0"/>
         </w:rPr>
-        <w:t>A session proceeds as in Figure 7.3. (1) A receiver connects to the sender’s TCP control port and receives one JSON line containing the session id, file name, size, chunk size, chunk count, SHA-256, group, port, SNTP port and protocol parameters. (2) It performs five SNTP exchanges and keeps the sample with the smallest round-trip delay. (3) It joins the multicast group and reports ready over TCP. (4) When all N receivers are ready the sender multicasts DATA at the configured rate, interleaving HEARTBEATs so tail losses are noticed. (5) Receivers detect gaps, run the NACK timer of Section 7.4 (Figure 7.4), and the sender answers with REPAIR packets. (6) After verifying the digest each receiver returns its statistics over TCP and the sender multicasts FIN. The receiver passes through the states CONNECT, SYNC, JOINED, RECEIVING, REPAIRING and VERIFY.</w:t>
+        <w:t>A session runs as in Figure 7.3. (1) A receiver connects to the sender’s TCP control port and gets one JSON line with the session id, file name, size, chunk size, chunk count, SHA-256, group, port, SNTP port and protocol parameters. (2) It makes five SNTP exchanges and keeps the sample with the smallest round-trip delay. (3) It joins the multicast group and reports ready over TCP. (4) Once all N receivers are ready, the sender multicasts DATA at the configured rate and mixes in HEARTBEATs so that tail losses get noticed. (5) Receivers detect gaps and run the NACK timer described in Section 7.4 (Figure 7.4), and the sender answers with REPAIR packets. (6) After checking the digest, each receiver returns its statistics over TCP and the sender multicasts FIN. A receiver moves through the states CONNECT, SYNC, JOINED, RECEIVING, REPAIRING and VERIFY.</w:t>
       </w:r>
     </w:p>
     <w:p>
@@ -3298,7 +3298,7 @@
           <w:b w:val="0"/>
           <w:i w:val="0"/>
         </w:rPr>
-        <w:t xml:space="preserve"> Because the ReliCast sender holds repair requests for 10 ms and sends the union of the requested ranges once, a chunk is repaired at most about once regardless of how many receivers missed it. The fraction of chunks missed by at least one receiver is u = 1 − (1−q)(1−p)^N, so R_relicast ≈ C·u (7), compared with R_naive ≈ C·N·p′. For the demonstration point (N = 6, p = 8%, q = 3%) the model gives p′ = 0.108, about 331 expected losses and u = 0.41, hence about 211 distinct chunks to repair against 331 repair packets for the naive scheme; the measured values are 241 and 319. Differences arise from retries and from NACK and repair packets that are themselves lost, which this first-order model ignores.</w:t>
+        <w:t xml:space="preserve"> Because the ReliCast sender holds repair requests for 6 ms and sends the union of the requested ranges once, a chunk is repaired at most about once regardless of how many receivers missed it. The fraction of chunks missed by at least one receiver is u = 1 − (1−q)(1−p)^N, so R_relicast ≈ C·u (7), compared with R_naive ≈ C·N·p′. For the demonstration point (N = 6, p = 8%, q = 3%) the model gives p′ = 0.108, about 331 expected losses and u = 0.41, hence about 211 distinct chunks to repair against 331 repair packets for the naive scheme; the measured values are 241 and 319. Differences arise from retries and from NACK and repair packets that are themselves lost, which this first-order model ignores.</w:t>
       </w:r>
     </w:p>
     <w:p>
@@ -3349,7 +3349,7 @@
           <w:b w:val="0"/>
           <w:i w:val="0"/>
         </w:rPr>
-        <w:t xml:space="preserve"> Each receiver keeps an exponentially weighted moving average of the SNTP-corrected one-way delay and of the delay variation, and sets W = min(200, max(20, 20 + 4(ô + 4ĵ))) milliseconds (8), where ô is the delay average and ĵ the jitter average, so a quiet LAN uses a short window (fast recovery) and a noisy one a longer window (fewer duplicates).</w:t>
+        <w:t xml:space="preserve"> Each receiver keeps an exponentially weighted moving average of the SNTP-corrected one-way delay and of the delay variation, and sets W = min(100, max(10, 10 + 3(ô + 4ĵ))) milliseconds (8), where ô is the delay average and ĵ the jitter average. A quiet LAN therefore gets a short window and fast recovery, and a noisy one gets a longer window and fewer duplicate NACKs. Gaps found within one window share a single request round, so a receiver sends one batched NACK per round and not one per missing chunk.</w:t>
       </w:r>
     </w:p>
     <w:p>
@@ -3371,7 +3371,7 @@
           <w:rFonts w:ascii="Times New Roman" w:hAnsi="Times New Roman" w:eastAsia="Times New Roman" w:cs="Times New Roman"/>
           <w:i/>
         </w:rPr>
-        <w:t>W = clamp( 20 ms + 4 ( ô + 4 ĵ ) , 20 ms , 200 ms )</w:t>
+        <w:t>W = clamp( 10 ms + 3 ( ô + 4 ĵ ) , 10 ms , 100 ms )</w:t>
       </w:r>
       <w:r>
         <w:rPr>
@@ -3699,7 +3699,7 @@
                 <w:rFonts w:ascii="Courier New" w:hAnsi="Courier New" w:eastAsia="Courier New" w:cs="Courier New"/>
                 <w:sz w:val="17"/>
               </w:rPr>
-              <w:t xml:space="preserve">          running, start 10 ms hold-off timer</w:t>
+              <w:t xml:space="preserve">          running, start 6 ms hold-off timer</w:t>
               <w:br/>
             </w:r>
             <w:r>
@@ -3839,7 +3839,15 @@
                 <w:rFonts w:ascii="Courier New" w:hAnsi="Courier New" w:eastAsia="Courier New" w:cs="Courier New"/>
                 <w:sz w:val="17"/>
               </w:rPr>
-              <w:t xml:space="preserve">    on HEARTBEAT(h) or seq jump: missing &lt;- ranges not in have</w:t>
+              <w:t xml:space="preserve">    on HEARTBEAT(h) or seq jump: missing &lt;- ranges not in have;</w:t>
+              <w:br/>
+            </w:r>
+            <w:r>
+              <w:rPr>
+                <w:rFonts w:ascii="Courier New" w:hAnsi="Courier New" w:eastAsia="Courier New" w:cs="Courier New"/>
+                <w:sz w:val="17"/>
+              </w:rPr>
+              <w:t xml:space="preserve">        gaps seen in one window share one request round, timer U[0, W)</w:t>
               <w:br/>
             </w:r>
             <w:r>
@@ -3918,7 +3926,7 @@
           <w:b w:val="0"/>
           <w:i w:val="0"/>
         </w:rPr>
-        <w:t>The multicast receive socket is created with socket(AF_INET, SOCK_DGRAM, IPPROTO_UDP), SO_REUSEADDR (and SO_REUSEPORT where it exists) so that several receiver processes can share the port on one host, bound to the wildcard address (binding to the group address is not portable to Windows), and joined with IP_ADD_MEMBERSHIP using an ip_mreq structure built with inet_aton. The send socket sets IP_MULTICAST_TTL (1, so traffic stays on the link), IP_MULTICAST_LOOP and IP_MULTICAST_IF to select the interface, and pacing is done in user space because UDP has no flow control. Table 7.1 maps these calls to the syllabus units.</w:t>
+        <w:t>The multicast receive socket is created with socket(AF_INET, SOCK_DGRAM, IPPROTO_UDP) and SO_REUSEADDR (plus SO_REUSEPORT where it exists), so that several receiver processes can share the port on one host. It is bound to the wildcard address, because binding to the group address is not portable to Windows, and joined to the group with IP_ADD_MEMBERSHIP using an ip_mreq structure built with inet_aton. The send socket sets IP_MULTICAST_TTL to 1 so traffic stays on the link, IP_MULTICAST_LOOP, and IP_MULTICAST_IF to choose the interface. Pacing is done in user space because UDP has no flow control. Table 7.1 maps these calls to the syllabus units.</w:t>
       </w:r>
     </w:p>
     <w:p>
@@ -6404,7 +6412,7 @@
           <w:b w:val="0"/>
           <w:i w:val="0"/>
         </w:rPr>
-        <w:t xml:space="preserve">This work implemented ReliCast, a NACK-oriented reliable multicast file-distribution protocol built directly on the socket API, together with TCP, raw-UDP and naive-multicast baselines and an SNTP client and server for synchronised delay measurement. </w:t>
+        <w:t xml:space="preserve">We implemented ReliCast, a NACK-oriented reliable multicast file-distribution protocol built directly on the socket API, along with TCP, raw-UDP and naive-multicast baselines and an SNTP client and server for synchronised delay measurement. </w:t>
       </w:r>
       <w:r>
         <w:rPr>
@@ -6442,7 +6450,7 @@
           <w:b w:val="0"/>
           <w:i w:val="0"/>
         </w:rPr>
-        <w:t xml:space="preserve"> The study supplies what the SRM and NORM literature lacks: measurements from real sockets in a reproducible harness, a suppression window adapted from SNTP-synchronised delay and jitter, and a direct quantitative comparison with the three practical baselines. It demonstrates that the central mechanisms of SRM (random timers, suppression, back-off) and NORM (sender-side aggregation, heartbeats) carry over to a small, dependency-free Python implementation.</w:t>
+        <w:t xml:space="preserve"> The study provides what the SRM and NORM literature lacks: measurements from real sockets in a reproducible harness, a suppression window adapted from SNTP-synchronised delay and jitter, and a direct quantitative comparison with three practical baselines. It also shows that the central mechanisms of SRM (random timers, suppression, back-off) and NORM (sender-side aggregation, heartbeats) carry over to a small, dependency-free Python implementation.</w:t>
       </w:r>
     </w:p>
     <w:p>

</xml_diff>